<commit_message>
Add IMMUcan BREAS and missing panel-change rungs
</commit_message>
<xml_diff>
--- a/1020manuscript.docx
+++ b/1020manuscript.docx
@@ -4796,7 +4796,7 @@
           <w:sz w:val="22"/>
           <w:szCs w:val="22"/>
         </w:rPr>
-        <w:t>A second real panel change, across 27 shared channels in the colorectal-to-GVHD pair, was harder. Coverage stayed at 0.98 or above up to 8,000 labels. Without refitting, acceptance at 8,000 labels reached 0.03 at a 10% budget and 0.20 at 20%, against 0.15 and 0.41 for source calibration, which covered only 0.67 and 0.47. A refit on 1,000 labels reached 0.42 at 10% (Table 3). The MIBI-TOF microarray supplied a stronger cohort-level pairing. Its source was the depot breast cohort, 5,293 training cells over 22 channels, and its target was two breast carcinoma cores, 23,081 cells over 15 markers, from another laboratory and platform; eight markers were shared and the donors differed. At a 10% budget, 1,000 labels retained 0.62 at selective error 0.05 and +0.55 net; 500 labels retained 0.45 at 0.03 and +0.42. The same protocol gave +0.03 on a 5,458-cell colon core and +0.04 on a 65,498-cell tonsil core, and 4,000 labels returned +0.44 on the tonsil pair. To our knowledge, no public cohort pairs the same patient or serial sections across two antibody panels in two laboratories with cell-level labels, so the evidence is cohort-level, with different donors. A second colon source marks the boundary: at 8,153 cells, 1,000 labels leave the certificate silent at 10% and 4,000 labels are half the batch; no rung is net positive, and the least bad refit is −0.28 at 20%. The label-to-batch ratio, not the certificate, sets that boundary. Fig. 6D places the four external panel changes on the same net-review scale.</w:t>
+        <w:t>A second real panel change, across 27 shared channels in the colorectal-to-GVHD pair, was harder. Coverage stayed at 0.98 or above up to 8,000 labels. Without refitting, acceptance at 8,000 labels reached 0.03 at a 10% budget and 0.20 at 20%, against 0.15 and 0.41 for source calibration, which covered only 0.67 and 0.47. A refit on 1,000 labels reached 0.42 at 10% (Table 3). The MIBI-TOF microarray supplied a stronger cohort-level pairing. Its source was the depot breast cohort, 5,293 training cells over 22 channels, and its target was two breast carcinoma cores, 23,081 cells over 15 markers, from another laboratory and platform; eight markers were shared and the donors differed. At a 10% budget, 1,000 labels retained 0.62 at selective error 0.05 and +0.55 net; 500 labels retained 0.45 at 0.03 and +0.42. The same protocol gave +0.03 on a 5,458-cell colon core and +0.04 on a 65,498-cell tonsil core. The colon core needed a 20% budget for a positive return: 1,000 labels retained 0.70 at 0.11 and +0.39 net. A second breast target, IMMUcan BREAS, had 21,731 cells and 12 shared markers; with 1,000 labels, coverage was 1.00 and net +0.92 for histogram gradient boosting and +0.85 for random forest (Table 3). The tonsil pair returned +0.34 at 2,000 labels and +0.44 at 4,000. To our knowledge, no public cohort pairs the same patient or serial sections across two antibody panels in two laboratories with cell-level labels, so the evidence is cohort-level, with different donors. A second colon source marks the boundary: at 8,153 cells, 1,000 labels leave the certificate silent at 10% and 4,000 labels are half the batch; no rung is net positive, and the least bad refit is −0.28 at 20%. The label-to-batch ratio, not the certificate, sets that boundary. Fig. 6D places four of these external panel changes on the same net-review scale.</w:t>
       </w:r>
     </w:p>
     <w:p>
@@ -5556,38 +5556,41 @@
             </w:pPr>
             <w:r>
               <w:rPr>
-                <w:sz w:val="16"/>
-              </w:rPr>
-              <w:t>Ion beam microarray, colon core, STELLAR source</w:t>
-            </w:r>
-          </w:p>
-        </w:tc>
-        <w:tc>
-          <w:tcPr>
-            <w:tcW w:w="0" w:type="auto"/>
-          </w:tcPr>
-          <w:p>
-            <w:pPr>
-              <w:spacing w:after="0" w:line="360" w:lineRule="auto"/>
-            </w:pPr>
-            <w:r>
-              <w:rPr>
-                <w:sz w:val="16"/>
-              </w:rPr>
-              <w:t>panel swap, 10 shared, repaired, 4,000 labels</w:t>
-            </w:r>
-          </w:p>
-        </w:tc>
-        <w:tc>
-          <w:tcPr>
-            <w:tcW w:w="0" w:type="auto"/>
-          </w:tcPr>
-          <w:p>
-            <w:pPr>
-              <w:spacing w:after="0" w:line="360" w:lineRule="auto"/>
-            </w:pPr>
-            <w:r>
-              <w:rPr>
+                <w:rFonts w:ascii="Times New Roman" w:hAnsi="Times New Roman" w:eastAsia="Times New Roman"/>
+                <w:sz w:val="16"/>
+              </w:rPr>
+              <w:t>Ion beam microarray, colon core</w:t>
+            </w:r>
+          </w:p>
+        </w:tc>
+        <w:tc>
+          <w:tcPr>
+            <w:tcW w:w="0" w:type="auto"/>
+          </w:tcPr>
+          <w:p>
+            <w:pPr>
+              <w:spacing w:after="0" w:line="360" w:lineRule="auto"/>
+            </w:pPr>
+            <w:r>
+              <w:rPr>
+                <w:rFonts w:ascii="Times New Roman" w:hAnsi="Times New Roman" w:eastAsia="Times New Roman"/>
+                <w:sz w:val="16"/>
+              </w:rPr>
+              <w:t>panel swap, 13 shared, repaired, 20% budget</w:t>
+            </w:r>
+          </w:p>
+        </w:tc>
+        <w:tc>
+          <w:tcPr>
+            <w:tcW w:w="0" w:type="auto"/>
+          </w:tcPr>
+          <w:p>
+            <w:pPr>
+              <w:spacing w:after="0" w:line="360" w:lineRule="auto"/>
+            </w:pPr>
+            <w:r>
+              <w:rPr>
+                <w:rFonts w:ascii="Times New Roman" w:hAnsi="Times New Roman" w:eastAsia="Times New Roman"/>
                 <w:sz w:val="16"/>
               </w:rPr>
               <w:t>0.20</w:t>
@@ -5604,38 +5607,41 @@
             </w:pPr>
             <w:r>
               <w:rPr>
-                <w:sz w:val="16"/>
-              </w:rPr>
-              <w:t>0.42</w:t>
-            </w:r>
-          </w:p>
-        </w:tc>
-        <w:tc>
-          <w:tcPr>
-            <w:tcW w:w="0" w:type="auto"/>
-          </w:tcPr>
-          <w:p>
-            <w:pPr>
-              <w:spacing w:after="0" w:line="360" w:lineRule="auto"/>
-            </w:pPr>
-            <w:r>
-              <w:rPr>
-                <w:sz w:val="16"/>
-              </w:rPr>
-              <w:t>0.13</w:t>
-            </w:r>
-          </w:p>
-        </w:tc>
-        <w:tc>
-          <w:tcPr>
-            <w:tcW w:w="0" w:type="auto"/>
-          </w:tcPr>
-          <w:p>
-            <w:pPr>
-              <w:spacing w:after="0" w:line="360" w:lineRule="auto"/>
-            </w:pPr>
-            <w:r>
-              <w:rPr>
+                <w:rFonts w:ascii="Times New Roman" w:hAnsi="Times New Roman" w:eastAsia="Times New Roman"/>
+                <w:sz w:val="16"/>
+              </w:rPr>
+              <w:t>0.70</w:t>
+            </w:r>
+          </w:p>
+        </w:tc>
+        <w:tc>
+          <w:tcPr>
+            <w:tcW w:w="0" w:type="auto"/>
+          </w:tcPr>
+          <w:p>
+            <w:pPr>
+              <w:spacing w:after="0" w:line="360" w:lineRule="auto"/>
+            </w:pPr>
+            <w:r>
+              <w:rPr>
+                <w:rFonts w:ascii="Times New Roman" w:hAnsi="Times New Roman" w:eastAsia="Times New Roman"/>
+                <w:sz w:val="16"/>
+              </w:rPr>
+              <w:t>0.11</w:t>
+            </w:r>
+          </w:p>
+        </w:tc>
+        <w:tc>
+          <w:tcPr>
+            <w:tcW w:w="0" w:type="auto"/>
+          </w:tcPr>
+          <w:p>
+            <w:pPr>
+              <w:spacing w:after="0" w:line="360" w:lineRule="auto"/>
+            </w:pPr>
+            <w:r>
+              <w:rPr>
+                <w:rFonts w:ascii="Times New Roman" w:hAnsi="Times New Roman" w:eastAsia="Times New Roman"/>
                 <w:sz w:val="16"/>
               </w:rPr>
               <w:t>1.00</w:t>
@@ -5659,71 +5665,71 @@
               <w:rPr>
                 <w:sz w:val="16"/>
               </w:rPr>
-              <w:t>Ion beam microarray, breast cores</w:t>
-            </w:r>
-          </w:p>
-        </w:tc>
-        <w:tc>
-          <w:tcPr>
-            <w:tcW w:w="0" w:type="auto"/>
-          </w:tcPr>
-          <w:p>
-            <w:pPr>
-              <w:spacing w:after="0" w:line="360" w:lineRule="auto"/>
-            </w:pPr>
-            <w:r>
-              <w:rPr>
-                <w:sz w:val="16"/>
-              </w:rPr>
-              <w:t>cohort-level panel swap, 8 shared, repaired</w:t>
-            </w:r>
-          </w:p>
-        </w:tc>
-        <w:tc>
-          <w:tcPr>
-            <w:tcW w:w="0" w:type="auto"/>
-          </w:tcPr>
-          <w:p>
-            <w:pPr>
-              <w:spacing w:after="0" w:line="360" w:lineRule="auto"/>
-            </w:pPr>
-            <w:r>
-              <w:rPr>
-                <w:sz w:val="16"/>
-              </w:rPr>
-              <w:t>0.10</w:t>
-            </w:r>
-          </w:p>
-        </w:tc>
-        <w:tc>
-          <w:tcPr>
-            <w:tcW w:w="0" w:type="auto"/>
-          </w:tcPr>
-          <w:p>
-            <w:pPr>
-              <w:spacing w:after="0" w:line="360" w:lineRule="auto"/>
-            </w:pPr>
-            <w:r>
-              <w:rPr>
-                <w:sz w:val="16"/>
-              </w:rPr>
-              <w:t>0.62</w:t>
-            </w:r>
-          </w:p>
-        </w:tc>
-        <w:tc>
-          <w:tcPr>
-            <w:tcW w:w="0" w:type="auto"/>
-          </w:tcPr>
-          <w:p>
-            <w:pPr>
-              <w:spacing w:after="0" w:line="360" w:lineRule="auto"/>
-            </w:pPr>
-            <w:r>
-              <w:rPr>
-                <w:sz w:val="16"/>
-              </w:rPr>
-              <w:t>0.05</w:t>
+              <w:t>Ion beam microarray, colon core, STELLAR source</w:t>
+            </w:r>
+          </w:p>
+        </w:tc>
+        <w:tc>
+          <w:tcPr>
+            <w:tcW w:w="0" w:type="auto"/>
+          </w:tcPr>
+          <w:p>
+            <w:pPr>
+              <w:spacing w:after="0" w:line="360" w:lineRule="auto"/>
+            </w:pPr>
+            <w:r>
+              <w:rPr>
+                <w:sz w:val="16"/>
+              </w:rPr>
+              <w:t>panel swap, 10 shared, repaired, 4,000 labels</w:t>
+            </w:r>
+          </w:p>
+        </w:tc>
+        <w:tc>
+          <w:tcPr>
+            <w:tcW w:w="0" w:type="auto"/>
+          </w:tcPr>
+          <w:p>
+            <w:pPr>
+              <w:spacing w:after="0" w:line="360" w:lineRule="auto"/>
+            </w:pPr>
+            <w:r>
+              <w:rPr>
+                <w:sz w:val="16"/>
+              </w:rPr>
+              <w:t>0.20</w:t>
+            </w:r>
+          </w:p>
+        </w:tc>
+        <w:tc>
+          <w:tcPr>
+            <w:tcW w:w="0" w:type="auto"/>
+          </w:tcPr>
+          <w:p>
+            <w:pPr>
+              <w:spacing w:after="0" w:line="360" w:lineRule="auto"/>
+            </w:pPr>
+            <w:r>
+              <w:rPr>
+                <w:sz w:val="16"/>
+              </w:rPr>
+              <w:t>0.42</w:t>
+            </w:r>
+          </w:p>
+        </w:tc>
+        <w:tc>
+          <w:tcPr>
+            <w:tcW w:w="0" w:type="auto"/>
+          </w:tcPr>
+          <w:p>
+            <w:pPr>
+              <w:spacing w:after="0" w:line="360" w:lineRule="auto"/>
+            </w:pPr>
+            <w:r>
+              <w:rPr>
+                <w:sz w:val="16"/>
+              </w:rPr>
+              <w:t>0.13</w:t>
             </w:r>
           </w:p>
         </w:tc>
@@ -5760,23 +5766,23 @@
               <w:rPr>
                 <w:sz w:val="16"/>
               </w:rPr>
-              <w:t>Ion beam microarray, tonsil cores</w:t>
-            </w:r>
-          </w:p>
-        </w:tc>
-        <w:tc>
-          <w:tcPr>
-            <w:tcW w:w="0" w:type="auto"/>
-          </w:tcPr>
-          <w:p>
-            <w:pPr>
-              <w:spacing w:after="0" w:line="360" w:lineRule="auto"/>
-            </w:pPr>
-            <w:r>
-              <w:rPr>
-                <w:sz w:val="16"/>
-              </w:rPr>
-              <w:t>panel swap, 11 shared, repaired</w:t>
+              <w:t>Ion beam microarray, breast cores</w:t>
+            </w:r>
+          </w:p>
+        </w:tc>
+        <w:tc>
+          <w:tcPr>
+            <w:tcW w:w="0" w:type="auto"/>
+          </w:tcPr>
+          <w:p>
+            <w:pPr>
+              <w:spacing w:after="0" w:line="360" w:lineRule="auto"/>
+            </w:pPr>
+            <w:r>
+              <w:rPr>
+                <w:sz w:val="16"/>
+              </w:rPr>
+              <w:t>cohort-level panel swap, 8 shared, repaired</w:t>
             </w:r>
           </w:p>
         </w:tc>
@@ -5808,23 +5814,23 @@
               <w:rPr>
                 <w:sz w:val="16"/>
               </w:rPr>
+              <w:t>0.62</w:t>
+            </w:r>
+          </w:p>
+        </w:tc>
+        <w:tc>
+          <w:tcPr>
+            <w:tcW w:w="0" w:type="auto"/>
+          </w:tcPr>
+          <w:p>
+            <w:pPr>
+              <w:spacing w:after="0" w:line="360" w:lineRule="auto"/>
+            </w:pPr>
+            <w:r>
+              <w:rPr>
+                <w:sz w:val="16"/>
+              </w:rPr>
               <w:t>0.05</w:t>
-            </w:r>
-          </w:p>
-        </w:tc>
-        <w:tc>
-          <w:tcPr>
-            <w:tcW w:w="0" w:type="auto"/>
-          </w:tcPr>
-          <w:p>
-            <w:pPr>
-              <w:spacing w:after="0" w:line="360" w:lineRule="auto"/>
-            </w:pPr>
-            <w:r>
-              <w:rPr>
-                <w:sz w:val="16"/>
-              </w:rPr>
-              <w:t>0.03</w:t>
             </w:r>
           </w:p>
         </w:tc>
@@ -5877,7 +5883,7 @@
               <w:rPr>
                 <w:sz w:val="16"/>
               </w:rPr>
-              <w:t>panel swap, 11 shared, repaired, 4,000 labels</w:t>
+              <w:t>panel swap, 11 shared, repaired</w:t>
             </w:r>
           </w:p>
         </w:tc>
@@ -5909,23 +5915,23 @@
               <w:rPr>
                 <w:sz w:val="16"/>
               </w:rPr>
-              <w:t>0.53</w:t>
-            </w:r>
-          </w:p>
-        </w:tc>
-        <w:tc>
-          <w:tcPr>
-            <w:tcW w:w="0" w:type="auto"/>
-          </w:tcPr>
-          <w:p>
-            <w:pPr>
-              <w:spacing w:after="0" w:line="360" w:lineRule="auto"/>
-            </w:pPr>
-            <w:r>
-              <w:rPr>
-                <w:sz w:val="16"/>
-              </w:rPr>
-              <w:t>0.07</w:t>
+              <w:t>0.05</w:t>
+            </w:r>
+          </w:p>
+        </w:tc>
+        <w:tc>
+          <w:tcPr>
+            <w:tcW w:w="0" w:type="auto"/>
+          </w:tcPr>
+          <w:p>
+            <w:pPr>
+              <w:spacing w:after="0" w:line="360" w:lineRule="auto"/>
+            </w:pPr>
+            <w:r>
+              <w:rPr>
+                <w:sz w:val="16"/>
+              </w:rPr>
+              <w:t>0.03</w:t>
             </w:r>
           </w:p>
         </w:tc>
@@ -5960,38 +5966,41 @@
             </w:pPr>
             <w:r>
               <w:rPr>
-                <w:sz w:val="16"/>
-              </w:rPr>
-              <w:t>Liver biopsies</w:t>
-            </w:r>
-          </w:p>
-        </w:tc>
-        <w:tc>
-          <w:tcPr>
-            <w:tcW w:w="0" w:type="auto"/>
-          </w:tcPr>
-          <w:p>
-            <w:pPr>
-              <w:spacing w:after="0" w:line="360" w:lineRule="auto"/>
-            </w:pPr>
-            <w:r>
-              <w:rPr>
-                <w:sz w:val="16"/>
-              </w:rPr>
-              <w:t>exchangeable, own panel</w:t>
-            </w:r>
-          </w:p>
-        </w:tc>
-        <w:tc>
-          <w:tcPr>
-            <w:tcW w:w="0" w:type="auto"/>
-          </w:tcPr>
-          <w:p>
-            <w:pPr>
-              <w:spacing w:after="0" w:line="360" w:lineRule="auto"/>
-            </w:pPr>
-            <w:r>
-              <w:rPr>
+                <w:rFonts w:ascii="Times New Roman" w:hAnsi="Times New Roman" w:eastAsia="Times New Roman"/>
+                <w:sz w:val="16"/>
+              </w:rPr>
+              <w:t>Ion beam microarray, tonsil cores</w:t>
+            </w:r>
+          </w:p>
+        </w:tc>
+        <w:tc>
+          <w:tcPr>
+            <w:tcW w:w="0" w:type="auto"/>
+          </w:tcPr>
+          <w:p>
+            <w:pPr>
+              <w:spacing w:after="0" w:line="360" w:lineRule="auto"/>
+            </w:pPr>
+            <w:r>
+              <w:rPr>
+                <w:rFonts w:ascii="Times New Roman" w:hAnsi="Times New Roman" w:eastAsia="Times New Roman"/>
+                <w:sz w:val="16"/>
+              </w:rPr>
+              <w:t>panel swap, 11 shared, repaired, 2,000 labels</w:t>
+            </w:r>
+          </w:p>
+        </w:tc>
+        <w:tc>
+          <w:tcPr>
+            <w:tcW w:w="0" w:type="auto"/>
+          </w:tcPr>
+          <w:p>
+            <w:pPr>
+              <w:spacing w:after="0" w:line="360" w:lineRule="auto"/>
+            </w:pPr>
+            <w:r>
+              <w:rPr>
+                <w:rFonts w:ascii="Times New Roman" w:hAnsi="Times New Roman" w:eastAsia="Times New Roman"/>
                 <w:sz w:val="16"/>
               </w:rPr>
               <w:t>0.10</w:t>
@@ -6008,22 +6017,24 @@
             </w:pPr>
             <w:r>
               <w:rPr>
-                <w:sz w:val="16"/>
-              </w:rPr>
-              <w:t>0.995</w:t>
-            </w:r>
-          </w:p>
-        </w:tc>
-        <w:tc>
-          <w:tcPr>
-            <w:tcW w:w="0" w:type="auto"/>
-          </w:tcPr>
-          <w:p>
-            <w:pPr>
-              <w:spacing w:after="0" w:line="360" w:lineRule="auto"/>
-            </w:pPr>
-            <w:r>
-              <w:rPr>
+                <w:rFonts w:ascii="Times New Roman" w:hAnsi="Times New Roman" w:eastAsia="Times New Roman"/>
+                <w:sz w:val="16"/>
+              </w:rPr>
+              <w:t>0.38</w:t>
+            </w:r>
+          </w:p>
+        </w:tc>
+        <w:tc>
+          <w:tcPr>
+            <w:tcW w:w="0" w:type="auto"/>
+          </w:tcPr>
+          <w:p>
+            <w:pPr>
+              <w:spacing w:after="0" w:line="360" w:lineRule="auto"/>
+            </w:pPr>
+            <w:r>
+              <w:rPr>
+                <w:rFonts w:ascii="Times New Roman" w:hAnsi="Times New Roman" w:eastAsia="Times New Roman"/>
                 <w:sz w:val="16"/>
               </w:rPr>
               <w:t>0.06</w:t>
@@ -6040,6 +6051,7 @@
             </w:pPr>
             <w:r>
               <w:rPr>
+                <w:rFonts w:ascii="Times New Roman" w:hAnsi="Times New Roman" w:eastAsia="Times New Roman"/>
                 <w:sz w:val="16"/>
               </w:rPr>
               <w:t>1.00</w:t>
@@ -6063,23 +6075,23 @@
               <w:rPr>
                 <w:sz w:val="16"/>
               </w:rPr>
-              <w:t>Depot colorectal to GVHD</w:t>
-            </w:r>
-          </w:p>
-        </w:tc>
-        <w:tc>
-          <w:tcPr>
-            <w:tcW w:w="0" w:type="auto"/>
-          </w:tcPr>
-          <w:p>
-            <w:pPr>
-              <w:spacing w:after="0" w:line="360" w:lineRule="auto"/>
-            </w:pPr>
-            <w:r>
-              <w:rPr>
-                <w:sz w:val="16"/>
-              </w:rPr>
-              <w:t>panel swap, 27 shared, repaired</w:t>
+              <w:t>Ion beam microarray, tonsil cores</w:t>
+            </w:r>
+          </w:p>
+        </w:tc>
+        <w:tc>
+          <w:tcPr>
+            <w:tcW w:w="0" w:type="auto"/>
+          </w:tcPr>
+          <w:p>
+            <w:pPr>
+              <w:spacing w:after="0" w:line="360" w:lineRule="auto"/>
+            </w:pPr>
+            <w:r>
+              <w:rPr>
+                <w:sz w:val="16"/>
+              </w:rPr>
+              <w:t>panel swap, 11 shared, repaired, 4,000 labels</w:t>
             </w:r>
           </w:p>
         </w:tc>
@@ -6111,23 +6123,23 @@
               <w:rPr>
                 <w:sz w:val="16"/>
               </w:rPr>
-              <w:t>0.42</w:t>
-            </w:r>
-          </w:p>
-        </w:tc>
-        <w:tc>
-          <w:tcPr>
-            <w:tcW w:w="0" w:type="auto"/>
-          </w:tcPr>
-          <w:p>
-            <w:pPr>
-              <w:spacing w:after="0" w:line="360" w:lineRule="auto"/>
-            </w:pPr>
-            <w:r>
-              <w:rPr>
-                <w:sz w:val="16"/>
-              </w:rPr>
-              <w:t>0.04</w:t>
+              <w:t>0.53</w:t>
+            </w:r>
+          </w:p>
+        </w:tc>
+        <w:tc>
+          <w:tcPr>
+            <w:tcW w:w="0" w:type="auto"/>
+          </w:tcPr>
+          <w:p>
+            <w:pPr>
+              <w:spacing w:after="0" w:line="360" w:lineRule="auto"/>
+            </w:pPr>
+            <w:r>
+              <w:rPr>
+                <w:sz w:val="16"/>
+              </w:rPr>
+              <w:t>0.07</w:t>
             </w:r>
           </w:p>
         </w:tc>
@@ -6164,23 +6176,23 @@
               <w:rPr>
                 <w:sz w:val="16"/>
               </w:rPr>
-              <w:t>IMMUcan panel 1 V3</w:t>
-            </w:r>
-          </w:p>
-        </w:tc>
-        <w:tc>
-          <w:tcPr>
-            <w:tcW w:w="0" w:type="auto"/>
-          </w:tcPr>
-          <w:p>
-            <w:pPr>
-              <w:spacing w:after="0" w:line="360" w:lineRule="auto"/>
-            </w:pPr>
-            <w:r>
-              <w:rPr>
-                <w:sz w:val="16"/>
-              </w:rPr>
-              <w:t>sample-grouped folds, exchangeable</w:t>
+              <w:t>Liver biopsies</w:t>
+            </w:r>
+          </w:p>
+        </w:tc>
+        <w:tc>
+          <w:tcPr>
+            <w:tcW w:w="0" w:type="auto"/>
+          </w:tcPr>
+          <w:p>
+            <w:pPr>
+              <w:spacing w:after="0" w:line="360" w:lineRule="auto"/>
+            </w:pPr>
+            <w:r>
+              <w:rPr>
+                <w:sz w:val="16"/>
+              </w:rPr>
+              <w:t>exchangeable, own panel</w:t>
             </w:r>
           </w:p>
         </w:tc>
@@ -6212,23 +6224,23 @@
               <w:rPr>
                 <w:sz w:val="16"/>
               </w:rPr>
-              <w:t>0.99</w:t>
-            </w:r>
-          </w:p>
-        </w:tc>
-        <w:tc>
-          <w:tcPr>
-            <w:tcW w:w="0" w:type="auto"/>
-          </w:tcPr>
-          <w:p>
-            <w:pPr>
-              <w:spacing w:after="0" w:line="360" w:lineRule="auto"/>
-            </w:pPr>
-            <w:r>
-              <w:rPr>
-                <w:sz w:val="16"/>
-              </w:rPr>
-              <w:t>0.07</w:t>
+              <w:t>0.995</w:t>
+            </w:r>
+          </w:p>
+        </w:tc>
+        <w:tc>
+          <w:tcPr>
+            <w:tcW w:w="0" w:type="auto"/>
+          </w:tcPr>
+          <w:p>
+            <w:pPr>
+              <w:spacing w:after="0" w:line="360" w:lineRule="auto"/>
+            </w:pPr>
+            <w:r>
+              <w:rPr>
+                <w:sz w:val="16"/>
+              </w:rPr>
+              <w:t>0.06</w:t>
             </w:r>
           </w:p>
         </w:tc>
@@ -6265,23 +6277,23 @@
               <w:rPr>
                 <w:sz w:val="16"/>
               </w:rPr>
-              <w:t>IMMUcan panel 1 V1</w:t>
-            </w:r>
-          </w:p>
-        </w:tc>
-        <w:tc>
-          <w:tcPr>
-            <w:tcW w:w="0" w:type="auto"/>
-          </w:tcPr>
-          <w:p>
-            <w:pPr>
-              <w:spacing w:after="0" w:line="360" w:lineRule="auto"/>
-            </w:pPr>
-            <w:r>
-              <w:rPr>
-                <w:sz w:val="16"/>
-              </w:rPr>
-              <w:t>sample-grouped folds, exchangeable</w:t>
+              <w:t>Depot colorectal to GVHD</w:t>
+            </w:r>
+          </w:p>
+        </w:tc>
+        <w:tc>
+          <w:tcPr>
+            <w:tcW w:w="0" w:type="auto"/>
+          </w:tcPr>
+          <w:p>
+            <w:pPr>
+              <w:spacing w:after="0" w:line="360" w:lineRule="auto"/>
+            </w:pPr>
+            <w:r>
+              <w:rPr>
+                <w:sz w:val="16"/>
+              </w:rPr>
+              <w:t>panel swap, 27 shared, repaired</w:t>
             </w:r>
           </w:p>
         </w:tc>
@@ -6313,23 +6325,23 @@
               <w:rPr>
                 <w:sz w:val="16"/>
               </w:rPr>
-              <w:t>0.999</w:t>
-            </w:r>
-          </w:p>
-        </w:tc>
-        <w:tc>
-          <w:tcPr>
-            <w:tcW w:w="0" w:type="auto"/>
-          </w:tcPr>
-          <w:p>
-            <w:pPr>
-              <w:spacing w:after="0" w:line="360" w:lineRule="auto"/>
-            </w:pPr>
-            <w:r>
-              <w:rPr>
-                <w:sz w:val="16"/>
-              </w:rPr>
-              <w:t>0.065</w:t>
+              <w:t>0.42</w:t>
+            </w:r>
+          </w:p>
+        </w:tc>
+        <w:tc>
+          <w:tcPr>
+            <w:tcW w:w="0" w:type="auto"/>
+          </w:tcPr>
+          <w:p>
+            <w:pPr>
+              <w:spacing w:after="0" w:line="360" w:lineRule="auto"/>
+            </w:pPr>
+            <w:r>
+              <w:rPr>
+                <w:sz w:val="16"/>
+              </w:rPr>
+              <w:t>0.04</w:t>
             </w:r>
           </w:p>
         </w:tc>
@@ -6366,23 +6378,23 @@
               <w:rPr>
                 <w:sz w:val="16"/>
               </w:rPr>
-              <w:t>STELLAR small intestine to duodenum</w:t>
-            </w:r>
-          </w:p>
-        </w:tc>
-        <w:tc>
-          <w:tcPr>
-            <w:tcW w:w="0" w:type="auto"/>
-          </w:tcPr>
-          <w:p>
-            <w:pPr>
-              <w:spacing w:after="0" w:line="360" w:lineRule="auto"/>
-            </w:pPr>
-            <w:r>
-              <w:rPr>
-                <w:sz w:val="16"/>
-              </w:rPr>
-              <w:t>real panel change, 14 shared, per-domain z-score, three-model mean</w:t>
+              <w:t>IMMUcan panel 1 V3</w:t>
+            </w:r>
+          </w:p>
+        </w:tc>
+        <w:tc>
+          <w:tcPr>
+            <w:tcW w:w="0" w:type="auto"/>
+          </w:tcPr>
+          <w:p>
+            <w:pPr>
+              <w:spacing w:after="0" w:line="360" w:lineRule="auto"/>
+            </w:pPr>
+            <w:r>
+              <w:rPr>
+                <w:sz w:val="16"/>
+              </w:rPr>
+              <w:t>sample-grouped folds, exchangeable</w:t>
             </w:r>
           </w:p>
         </w:tc>
@@ -6414,23 +6426,23 @@
               <w:rPr>
                 <w:sz w:val="16"/>
               </w:rPr>
-              <w:t>0.21</w:t>
-            </w:r>
-          </w:p>
-        </w:tc>
-        <w:tc>
-          <w:tcPr>
-            <w:tcW w:w="0" w:type="auto"/>
-          </w:tcPr>
-          <w:p>
-            <w:pPr>
-              <w:spacing w:after="0" w:line="360" w:lineRule="auto"/>
-            </w:pPr>
-            <w:r>
-              <w:rPr>
-                <w:sz w:val="16"/>
-              </w:rPr>
-              <w:t>0.08</w:t>
+              <w:t>0.99</w:t>
+            </w:r>
+          </w:p>
+        </w:tc>
+        <w:tc>
+          <w:tcPr>
+            <w:tcW w:w="0" w:type="auto"/>
+          </w:tcPr>
+          <w:p>
+            <w:pPr>
+              <w:spacing w:after="0" w:line="360" w:lineRule="auto"/>
+            </w:pPr>
+            <w:r>
+              <w:rPr>
+                <w:sz w:val="16"/>
+              </w:rPr>
+              <w:t>0.07</w:t>
             </w:r>
           </w:p>
         </w:tc>
@@ -6467,6 +6479,422 @@
               <w:rPr>
                 <w:sz w:val="16"/>
               </w:rPr>
+              <w:t>IMMUcan panel 1 V1</w:t>
+            </w:r>
+          </w:p>
+        </w:tc>
+        <w:tc>
+          <w:tcPr>
+            <w:tcW w:w="0" w:type="auto"/>
+          </w:tcPr>
+          <w:p>
+            <w:pPr>
+              <w:spacing w:after="0" w:line="360" w:lineRule="auto"/>
+            </w:pPr>
+            <w:r>
+              <w:rPr>
+                <w:sz w:val="16"/>
+              </w:rPr>
+              <w:t>sample-grouped folds, exchangeable</w:t>
+            </w:r>
+          </w:p>
+        </w:tc>
+        <w:tc>
+          <w:tcPr>
+            <w:tcW w:w="0" w:type="auto"/>
+          </w:tcPr>
+          <w:p>
+            <w:pPr>
+              <w:spacing w:after="0" w:line="360" w:lineRule="auto"/>
+            </w:pPr>
+            <w:r>
+              <w:rPr>
+                <w:sz w:val="16"/>
+              </w:rPr>
+              <w:t>0.10</w:t>
+            </w:r>
+          </w:p>
+        </w:tc>
+        <w:tc>
+          <w:tcPr>
+            <w:tcW w:w="0" w:type="auto"/>
+          </w:tcPr>
+          <w:p>
+            <w:pPr>
+              <w:spacing w:after="0" w:line="360" w:lineRule="auto"/>
+            </w:pPr>
+            <w:r>
+              <w:rPr>
+                <w:sz w:val="16"/>
+              </w:rPr>
+              <w:t>0.999</w:t>
+            </w:r>
+          </w:p>
+        </w:tc>
+        <w:tc>
+          <w:tcPr>
+            <w:tcW w:w="0" w:type="auto"/>
+          </w:tcPr>
+          <w:p>
+            <w:pPr>
+              <w:spacing w:after="0" w:line="360" w:lineRule="auto"/>
+            </w:pPr>
+            <w:r>
+              <w:rPr>
+                <w:sz w:val="16"/>
+              </w:rPr>
+              <w:t>0.065</w:t>
+            </w:r>
+          </w:p>
+        </w:tc>
+        <w:tc>
+          <w:tcPr>
+            <w:tcW w:w="0" w:type="auto"/>
+          </w:tcPr>
+          <w:p>
+            <w:pPr>
+              <w:spacing w:after="0" w:line="360" w:lineRule="auto"/>
+            </w:pPr>
+            <w:r>
+              <w:rPr>
+                <w:sz w:val="16"/>
+              </w:rPr>
+              <w:t>1.00</w:t>
+            </w:r>
+          </w:p>
+        </w:tc>
+      </w:tr>
+      <w:tr>
+        <w:trPr>
+          <w:jc w:val="center"/>
+        </w:trPr>
+        <w:tc>
+          <w:tcPr>
+            <w:tcW w:w="0" w:type="auto"/>
+          </w:tcPr>
+          <w:p>
+            <w:pPr>
+              <w:spacing w:after="0" w:line="360" w:lineRule="auto"/>
+            </w:pPr>
+            <w:r>
+              <w:rPr>
+                <w:rFonts w:ascii="Times New Roman" w:hAnsi="Times New Roman" w:eastAsia="Times New Roman"/>
+                <w:sz w:val="16"/>
+              </w:rPr>
+              <w:t>IMMUcan BREAS, breast source, HGB</w:t>
+            </w:r>
+          </w:p>
+        </w:tc>
+        <w:tc>
+          <w:tcPr>
+            <w:tcW w:w="0" w:type="auto"/>
+          </w:tcPr>
+          <w:p>
+            <w:pPr>
+              <w:spacing w:after="0" w:line="360" w:lineRule="auto"/>
+            </w:pPr>
+            <w:r>
+              <w:rPr>
+                <w:rFonts w:ascii="Times New Roman" w:hAnsi="Times New Roman" w:eastAsia="Times New Roman"/>
+                <w:sz w:val="16"/>
+              </w:rPr>
+              <w:t>cohort-level panel swap, 12 shared, repaired, 1,000 labels</w:t>
+            </w:r>
+          </w:p>
+        </w:tc>
+        <w:tc>
+          <w:tcPr>
+            <w:tcW w:w="0" w:type="auto"/>
+          </w:tcPr>
+          <w:p>
+            <w:pPr>
+              <w:spacing w:after="0" w:line="360" w:lineRule="auto"/>
+            </w:pPr>
+            <w:r>
+              <w:rPr>
+                <w:rFonts w:ascii="Times New Roman" w:hAnsi="Times New Roman" w:eastAsia="Times New Roman"/>
+                <w:sz w:val="16"/>
+              </w:rPr>
+              <w:t>0.10</w:t>
+            </w:r>
+          </w:p>
+        </w:tc>
+        <w:tc>
+          <w:tcPr>
+            <w:tcW w:w="0" w:type="auto"/>
+          </w:tcPr>
+          <w:p>
+            <w:pPr>
+              <w:spacing w:after="0" w:line="360" w:lineRule="auto"/>
+            </w:pPr>
+            <w:r>
+              <w:rPr>
+                <w:rFonts w:ascii="Times New Roman" w:hAnsi="Times New Roman" w:eastAsia="Times New Roman"/>
+                <w:sz w:val="16"/>
+              </w:rPr>
+              <w:t>0.97</w:t>
+            </w:r>
+          </w:p>
+        </w:tc>
+        <w:tc>
+          <w:tcPr>
+            <w:tcW w:w="0" w:type="auto"/>
+          </w:tcPr>
+          <w:p>
+            <w:pPr>
+              <w:spacing w:after="0" w:line="360" w:lineRule="auto"/>
+            </w:pPr>
+            <w:r>
+              <w:rPr>
+                <w:rFonts w:ascii="Times New Roman" w:hAnsi="Times New Roman" w:eastAsia="Times New Roman"/>
+                <w:sz w:val="16"/>
+              </w:rPr>
+              <w:t>0.05</w:t>
+            </w:r>
+          </w:p>
+        </w:tc>
+        <w:tc>
+          <w:tcPr>
+            <w:tcW w:w="0" w:type="auto"/>
+          </w:tcPr>
+          <w:p>
+            <w:pPr>
+              <w:spacing w:after="0" w:line="360" w:lineRule="auto"/>
+            </w:pPr>
+            <w:r>
+              <w:rPr>
+                <w:rFonts w:ascii="Times New Roman" w:hAnsi="Times New Roman" w:eastAsia="Times New Roman"/>
+                <w:sz w:val="16"/>
+              </w:rPr>
+              <w:t>1.00</w:t>
+            </w:r>
+          </w:p>
+        </w:tc>
+      </w:tr>
+      <w:tr>
+        <w:trPr>
+          <w:jc w:val="center"/>
+        </w:trPr>
+        <w:tc>
+          <w:tcPr>
+            <w:tcW w:w="0" w:type="auto"/>
+          </w:tcPr>
+          <w:p>
+            <w:pPr>
+              <w:spacing w:after="0" w:line="360" w:lineRule="auto"/>
+            </w:pPr>
+            <w:r>
+              <w:rPr>
+                <w:rFonts w:ascii="Times New Roman" w:hAnsi="Times New Roman" w:eastAsia="Times New Roman"/>
+                <w:sz w:val="16"/>
+              </w:rPr>
+              <w:t>IMMUcan BREAS, breast source, RF</w:t>
+            </w:r>
+          </w:p>
+        </w:tc>
+        <w:tc>
+          <w:tcPr>
+            <w:tcW w:w="0" w:type="auto"/>
+          </w:tcPr>
+          <w:p>
+            <w:pPr>
+              <w:spacing w:after="0" w:line="360" w:lineRule="auto"/>
+            </w:pPr>
+            <w:r>
+              <w:rPr>
+                <w:rFonts w:ascii="Times New Roman" w:hAnsi="Times New Roman" w:eastAsia="Times New Roman"/>
+                <w:sz w:val="16"/>
+              </w:rPr>
+              <w:t>cohort-level panel swap, 12 shared, repaired, 1,000 labels</w:t>
+            </w:r>
+          </w:p>
+        </w:tc>
+        <w:tc>
+          <w:tcPr>
+            <w:tcW w:w="0" w:type="auto"/>
+          </w:tcPr>
+          <w:p>
+            <w:pPr>
+              <w:spacing w:after="0" w:line="360" w:lineRule="auto"/>
+            </w:pPr>
+            <w:r>
+              <w:rPr>
+                <w:rFonts w:ascii="Times New Roman" w:hAnsi="Times New Roman" w:eastAsia="Times New Roman"/>
+                <w:sz w:val="16"/>
+              </w:rPr>
+              <w:t>0.10</w:t>
+            </w:r>
+          </w:p>
+        </w:tc>
+        <w:tc>
+          <w:tcPr>
+            <w:tcW w:w="0" w:type="auto"/>
+          </w:tcPr>
+          <w:p>
+            <w:pPr>
+              <w:spacing w:after="0" w:line="360" w:lineRule="auto"/>
+            </w:pPr>
+            <w:r>
+              <w:rPr>
+                <w:rFonts w:ascii="Times New Roman" w:hAnsi="Times New Roman" w:eastAsia="Times New Roman"/>
+                <w:sz w:val="16"/>
+              </w:rPr>
+              <w:t>0.90</w:t>
+            </w:r>
+          </w:p>
+        </w:tc>
+        <w:tc>
+          <w:tcPr>
+            <w:tcW w:w="0" w:type="auto"/>
+          </w:tcPr>
+          <w:p>
+            <w:pPr>
+              <w:spacing w:after="0" w:line="360" w:lineRule="auto"/>
+            </w:pPr>
+            <w:r>
+              <w:rPr>
+                <w:rFonts w:ascii="Times New Roman" w:hAnsi="Times New Roman" w:eastAsia="Times New Roman"/>
+                <w:sz w:val="16"/>
+              </w:rPr>
+              <w:t>0.05</w:t>
+            </w:r>
+          </w:p>
+        </w:tc>
+        <w:tc>
+          <w:tcPr>
+            <w:tcW w:w="0" w:type="auto"/>
+          </w:tcPr>
+          <w:p>
+            <w:pPr>
+              <w:spacing w:after="0" w:line="360" w:lineRule="auto"/>
+            </w:pPr>
+            <w:r>
+              <w:rPr>
+                <w:rFonts w:ascii="Times New Roman" w:hAnsi="Times New Roman" w:eastAsia="Times New Roman"/>
+                <w:sz w:val="16"/>
+              </w:rPr>
+              <w:t>1.00</w:t>
+            </w:r>
+          </w:p>
+        </w:tc>
+      </w:tr>
+      <w:tr>
+        <w:trPr>
+          <w:jc w:val="center"/>
+        </w:trPr>
+        <w:tc>
+          <w:tcPr>
+            <w:tcW w:w="0" w:type="auto"/>
+          </w:tcPr>
+          <w:p>
+            <w:pPr>
+              <w:spacing w:after="0" w:line="360" w:lineRule="auto"/>
+            </w:pPr>
+            <w:r>
+              <w:rPr>
+                <w:sz w:val="16"/>
+              </w:rPr>
+              <w:t>STELLAR small intestine to duodenum</w:t>
+            </w:r>
+          </w:p>
+        </w:tc>
+        <w:tc>
+          <w:tcPr>
+            <w:tcW w:w="0" w:type="auto"/>
+          </w:tcPr>
+          <w:p>
+            <w:pPr>
+              <w:spacing w:after="0" w:line="360" w:lineRule="auto"/>
+            </w:pPr>
+            <w:r>
+              <w:rPr>
+                <w:sz w:val="16"/>
+              </w:rPr>
+              <w:t>real panel change, 14 shared, per-domain z-score, three-model mean</w:t>
+            </w:r>
+          </w:p>
+        </w:tc>
+        <w:tc>
+          <w:tcPr>
+            <w:tcW w:w="0" w:type="auto"/>
+          </w:tcPr>
+          <w:p>
+            <w:pPr>
+              <w:spacing w:after="0" w:line="360" w:lineRule="auto"/>
+            </w:pPr>
+            <w:r>
+              <w:rPr>
+                <w:sz w:val="16"/>
+              </w:rPr>
+              <w:t>0.10</w:t>
+            </w:r>
+          </w:p>
+        </w:tc>
+        <w:tc>
+          <w:tcPr>
+            <w:tcW w:w="0" w:type="auto"/>
+          </w:tcPr>
+          <w:p>
+            <w:pPr>
+              <w:spacing w:after="0" w:line="360" w:lineRule="auto"/>
+            </w:pPr>
+            <w:r>
+              <w:rPr>
+                <w:sz w:val="16"/>
+              </w:rPr>
+              <w:t>0.21</w:t>
+            </w:r>
+          </w:p>
+        </w:tc>
+        <w:tc>
+          <w:tcPr>
+            <w:tcW w:w="0" w:type="auto"/>
+          </w:tcPr>
+          <w:p>
+            <w:pPr>
+              <w:spacing w:after="0" w:line="360" w:lineRule="auto"/>
+            </w:pPr>
+            <w:r>
+              <w:rPr>
+                <w:sz w:val="16"/>
+              </w:rPr>
+              <w:t>0.08</w:t>
+            </w:r>
+          </w:p>
+        </w:tc>
+        <w:tc>
+          <w:tcPr>
+            <w:tcW w:w="0" w:type="auto"/>
+          </w:tcPr>
+          <w:p>
+            <w:pPr>
+              <w:spacing w:after="0" w:line="360" w:lineRule="auto"/>
+            </w:pPr>
+            <w:r>
+              <w:rPr>
+                <w:sz w:val="16"/>
+              </w:rPr>
+              <w:t>1.00</w:t>
+            </w:r>
+          </w:p>
+        </w:tc>
+      </w:tr>
+      <w:tr>
+        <w:trPr>
+          <w:jc w:val="center"/>
+        </w:trPr>
+        <w:tc>
+          <w:tcPr>
+            <w:tcW w:w="0" w:type="auto"/>
+          </w:tcPr>
+          <w:p>
+            <w:pPr>
+              <w:spacing w:after="0" w:line="360" w:lineRule="auto"/>
+            </w:pPr>
+            <w:r>
+              <w:rPr>
+                <w:sz w:val="16"/>
+              </w:rPr>
               <w:t>STELLAR small intestine to duodenum</w:t>
             </w:r>
           </w:p>
@@ -6561,7 +6989,7 @@
         <w:rPr>
           <w:sz w:val="18"/>
         </w:rPr>
-        <w:t>Notes: Every row uses the same certificate, split fraction and metric definitions as the benchmark. Repaired rows use 1,000 target labels unless a row states otherwise; selective error is computed among units that commit a non-empty set, whereas acceptance averages over all units. For the duodenum rows, target labels enter calibration only. The z-score row is the pre-specified pipeline; the rank row replaces that transform with a per-marker within-domain rank and reports the equal-weight ensemble of the three classifiers. Source-only calibration on the rank scores covers 0.00 at a 10% budget with realised selective error 0.25. The 20% arm reaches acceptance 0.83 with coverage 1.00, and the ROI-disjoint arm covers 0.90 [0.79, 0.96]. Base-model acceptance under the rank transform is 0.34, 0.33 and 0.48 for the linear model, gradient boosting and random forest. An empty accepted set counts as covered, so coverage 1.00 with low acceptance means the certificate declined to answer. The rows show exchangeable replications, failures, and repair or boundary cases; the full external table is in the released CSV. IMMUcan V1 and V3 are two disjoint annotation batches of one source; V1 contributes 290,226 labels from 149 samples. Sources: experiments/r34_phase2_certificate_summary.csv, experiments/r55_stellar_summary.csv, experiments/r69_external2_log1p_z_summary.csv, experiments/r72_panel_repair.csv, experiments/r75_immucan_summary.csv, experiments/r82_immucan_v1_summary.csv and experiments/r85_duodenum_crosspanel_summary.csv; the rank-normalised rerun is experiments/r87_duodenum_ranknorm_summary.csv.</w:t>
+        <w:t>Notes: Every row uses the same certificate, split fraction and metric definitions as the benchmark. Repaired rows use 1,000 target labels unless a row states otherwise; selective error is computed among units that commit a non-empty set, whereas acceptance averages over all units. For the duodenum rows, target labels enter calibration only. The z-score row is the pre-specified pipeline; the rank row replaces that transform with a per-marker within-domain rank and reports the equal-weight ensemble of the three classifiers. Source-only calibration on the rank scores covers 0.00 at a 10% budget with realised selective error 0.25. The 20% arm reaches acceptance 0.83 with coverage 1.00, and the ROI-disjoint arm covers 0.90 [0.79, 0.96]. Base-model acceptance under the rank transform is 0.34, 0.33 and 0.48 for the linear model, gradient boosting and random forest. The IMMUcan BREAS rows are a secondary repair analysis on the same IMMUcan V3 release, not an independent cohort: 12 markers were shared, 1,000 labels were split 500 for refit and 500 for calibration over 20 draws, and logistic regression was positive in 7 of 20 draws so only the two tree ensembles are tabulated. An empty accepted set counts as covered, so coverage 1.00 with low acceptance means the certificate declined to answer. The rows show exchangeable replications, failures, and repair or boundary cases; the full external table is in the released CSV. IMMUcan V1 and V3 are two disjoint annotation batches of one source; V1 contributes 290,226 labels from 149 samples. Sources: experiments/r34_phase2_certificate_summary.csv, experiments/r55_stellar_summary.csv, experiments/r69_external2_log1p_z_summary.csv, experiments/r72_panel_repair.csv, experiments/r75_immucan_summary.csv, experiments/r80_immucan_breast_repair_summary.csv, experiments/r81_immucan_breast_sourcefold_summary.csv, experiments/r82_immucan_v1_summary.csv and experiments/r85_duodenum_crosspanel_summary.csv; the rank-normalised rerun is experiments/r87_duodenum_ranknorm_summary.csv.</w:t>
       </w:r>
     </w:p>
     <w:p>
@@ -7228,7 +7656,7 @@
           <w:sz w:val="22"/>
           <w:szCs w:val="22"/>
         </w:rPr>
-        <w:t xml:space="preserve">External cohorts were the public STELLAR CODEX intestine and tonsil data, the MIBI tissue microarray and the liver imaging mass cytometry cohort. We also used the adult duodenum CODEX atlas and IMMUcan panel 1 V3 and V1. IMMUcan V3 and V1 contributed 57,791 and 290,226 labels over 37 markers from 30 and 149 disjoint samples, split by sample. The duodenum atlas contributed 211,424 labelled cells over 42 channels from three donors and 107 ROIs. The cross-panel replication used the 14 </w:t>
+        <w:t xml:space="preserve">External cohorts were the public STELLAR CODEX intestine and tonsil data, the MIBI tissue microarray and the liver imaging mass cytometry cohort. We also used the adult duodenum CODEX atlas and IMMUcan panel 1 V3 and V1. IMMUcan V3 and V1 contributed 57,791 and 290,226 labels over 37 markers from 30 and 149 disjoint samples, split by sample. The BREAS subset of IMMUcan V3 supplied 21,731 six-class target cells over 14 samples for the breast panel-change repair. The duodenum atlas contributed 211,424 labelled cells over 42 channels from three donors and 107 ROIs. The cross-panel replication used the 14 </w:t>
       </w:r>
       <w:r>
         <w:rPr>

</xml_diff>